<commit_message>
fixes al formulario de cotizaciones de ficha, ignora insumos vacios
</commit_message>
<xml_diff>
--- a/1.docx
+++ b/1.docx
@@ -210,8 +210,11 @@
     </w:p>
     <w:p>
       <w:r>
+        <w:rPr>
+          <w:noProof/>
+        </w:rPr>
         <w:drawing>
-          <wp:anchor distT="0" distB="0" distL="114300" distR="114300" simplePos="0" relativeHeight="251663360" behindDoc="0" locked="0" layoutInCell="1" allowOverlap="1" wp14:anchorId="7F246451" wp14:editId="3CB17D9F">
+          <wp:anchor distT="0" distB="0" distL="114300" distR="114300" simplePos="0" relativeHeight="251663360" behindDoc="0" locked="0" layoutInCell="1" allowOverlap="1" wp14:anchorId="7F246451" wp14:editId="62104E7D">
             <wp:simplePos x="0" y="0"/>
             <wp:positionH relativeFrom="column">
               <wp:posOffset>2432685</wp:posOffset>
@@ -368,8 +371,11 @@
     </w:p>
     <w:p>
       <w:r>
+        <w:rPr>
+          <w:noProof/>
+        </w:rPr>
         <w:drawing>
-          <wp:anchor distT="0" distB="0" distL="114300" distR="114300" simplePos="0" relativeHeight="251664384" behindDoc="0" locked="0" layoutInCell="1" allowOverlap="1" wp14:anchorId="7B95D629" wp14:editId="0288299F">
+          <wp:anchor distT="0" distB="0" distL="114300" distR="114300" simplePos="0" relativeHeight="251664384" behindDoc="0" locked="0" layoutInCell="1" allowOverlap="1" wp14:anchorId="7B95D629" wp14:editId="5678598D">
             <wp:simplePos x="0" y="0"/>
             <wp:positionH relativeFrom="column">
               <wp:posOffset>2661285</wp:posOffset>
@@ -491,7 +497,10 @@
         <w:t xml:space="preserve"> </w:t>
       </w:r>
       <w:r>
-        <w:t>Redirecciona al formulario de cotizaciones iniciales con un solo clic.</w:t>
+        <w:t xml:space="preserve">Abre un modal para crear una cotización de ficha </w:t>
+      </w:r>
+      <w:r>
+        <w:t>con un solo clic.</w:t>
       </w:r>
     </w:p>
     <w:p>
@@ -559,898 +568,48 @@
           <w:bCs/>
         </w:rPr>
         <w:lastRenderedPageBreak/>
-        <w:t>4. Módulo de Cotizaciones Iniciales</w:t>
-      </w:r>
-    </w:p>
-    <w:p>
-      <w:r>
-        <w:t>Este módulo es la herramienta encargada de presupuestar los servicios requeridos antes de que el vehículo ingrese formalmente al área de trabajo para su reparación.</w:t>
-      </w:r>
-    </w:p>
-    <w:p>
-      <w:pPr>
-        <w:rPr>
-          <w:b/>
-          <w:bCs/>
-        </w:rPr>
-      </w:pPr>
-      <w:r>
-        <w:rPr>
-          <w:b/>
-          <w:bCs/>
-        </w:rPr>
-        <w:t>4.1. Listado de Cotizaciones</w:t>
-      </w:r>
-    </w:p>
-    <w:p>
-      <w:r>
-        <w:t>Al ingresar al módulo, visualizará el historial de todas las cotizaciones iniciales registradas en el sistema. Esta pantalla cuenta con un diseño adaptable para asegurar la legibilidad en cualquier equipo:</w:t>
-      </w:r>
-    </w:p>
-    <w:p>
-      <w:pPr>
-        <w:numPr>
-          <w:ilvl w:val="0"/>
-          <w:numId w:val="10"/>
-        </w:numPr>
-      </w:pPr>
-      <w:r>
-        <w:rPr>
-          <w:b/>
-          <w:bCs/>
-        </w:rPr>
-        <w:t>Vista de Escritorio:</w:t>
-      </w:r>
-      <w:r>
-        <w:t xml:space="preserve"> La información se presenta en formato de </w:t>
-      </w:r>
-      <w:r>
-        <w:rPr>
-          <w:b/>
-          <w:bCs/>
-        </w:rPr>
-        <w:t>tabla</w:t>
-      </w:r>
-      <w:r>
-        <w:t xml:space="preserve"> detallada, permitiendo ver múltiples registros y columnas de datos de forma simultánea.</w:t>
-      </w:r>
-      <w:r>
-        <w:t xml:space="preserve"> </w:t>
-      </w:r>
-    </w:p>
-    <w:p>
-      <w:pPr>
-        <w:ind w:left="720"/>
-      </w:pPr>
-      <w:r>
+        <w:t>5. Módulo de Fichas de Trabajo</w:t>
+      </w:r>
+    </w:p>
+    <w:p>
+      <w:r>
+        <w:t>Este módulo representa el núcleo operativo de Neutro Transmisiones. Aquí se centraliza, documenta y gestiona toda la información del vehículo desde que ingresa a las instalaciones hasta que es devuelto al cliente.</w:t>
+      </w:r>
+    </w:p>
+    <w:p>
+      <w:pPr>
+        <w:rPr>
+          <w:b/>
+          <w:bCs/>
+        </w:rPr>
+      </w:pPr>
+      <w:r>
+        <w:rPr>
+          <w:b/>
+          <w:bCs/>
+        </w:rPr>
+        <w:t>5.1. Creación y Listado de Fichas</w:t>
+      </w:r>
+    </w:p>
+    <w:p>
+      <w:r>
+        <w:rPr>
+          <w:b/>
+          <w:bCs/>
+        </w:rPr>
+        <w:t>Creación Manual:</w:t>
+      </w:r>
+      <w:r>
+        <w:t xml:space="preserve"> A través del botón de nueva ficha, donde se despliega un formulario directo que requiere ingresar la información detallada del cliente y el motivo exacto de ingreso del vehículo.</w:t>
+      </w:r>
+    </w:p>
+    <w:p>
+      <w:r>
+        <w:rPr>
+          <w:noProof/>
+        </w:rPr>
         <w:drawing>
-          <wp:inline distT="0" distB="0" distL="0" distR="0" wp14:anchorId="127951F0" wp14:editId="76A712C6">
-            <wp:extent cx="3238500" cy="770890"/>
-            <wp:effectExtent l="0" t="0" r="0" b="0"/>
-            <wp:docPr id="897876169" name="Picture 1"/>
-            <wp:cNvGraphicFramePr>
-              <a:graphicFrameLocks xmlns:a="http://schemas.openxmlformats.org/drawingml/2006/main" noChangeAspect="1"/>
-            </wp:cNvGraphicFramePr>
-            <a:graphic xmlns:a="http://schemas.openxmlformats.org/drawingml/2006/main">
-              <a:graphicData uri="http://schemas.openxmlformats.org/drawingml/2006/picture">
-                <pic:pic xmlns:pic="http://schemas.openxmlformats.org/drawingml/2006/picture">
-                  <pic:nvPicPr>
-                    <pic:cNvPr id="897876169" name=""/>
-                    <pic:cNvPicPr/>
-                  </pic:nvPicPr>
-                  <pic:blipFill>
-                    <a:blip r:embed="rId7" cstate="print">
-                      <a:extLst>
-                        <a:ext uri="{28A0092B-C50C-407E-A947-70E740481C1C}">
-                          <a14:useLocalDpi xmlns:a14="http://schemas.microsoft.com/office/drawing/2010/main" val="0"/>
-                        </a:ext>
-                      </a:extLst>
-                    </a:blip>
-                    <a:stretch>
-                      <a:fillRect/>
-                    </a:stretch>
-                  </pic:blipFill>
-                  <pic:spPr>
-                    <a:xfrm>
-                      <a:off x="0" y="0"/>
-                      <a:ext cx="3238500" cy="770890"/>
-                    </a:xfrm>
-                    <a:prstGeom prst="rect">
-                      <a:avLst/>
-                    </a:prstGeom>
-                  </pic:spPr>
-                </pic:pic>
-              </a:graphicData>
-            </a:graphic>
-          </wp:inline>
-        </w:drawing>
-      </w:r>
-    </w:p>
-    <w:p>
-      <w:pPr>
-        <w:numPr>
-          <w:ilvl w:val="0"/>
-          <w:numId w:val="10"/>
-        </w:numPr>
-        <w:rPr>
-          <w:b/>
-          <w:bCs/>
-        </w:rPr>
-      </w:pPr>
-      <w:r>
-        <w:rPr>
-          <w:b/>
-          <w:bCs/>
-        </w:rPr>
-        <w:t>Vista Móvil:</w:t>
-      </w:r>
-      <w:r>
-        <w:t xml:space="preserve"> El listado se transforma automáticamente en un formato de </w:t>
-      </w:r>
-      <w:r>
-        <w:rPr>
-          <w:b/>
-          <w:bCs/>
-        </w:rPr>
-        <w:t>tarjetas</w:t>
-      </w:r>
-      <w:r>
-        <w:t xml:space="preserve"> (</w:t>
-      </w:r>
-      <w:proofErr w:type="spellStart"/>
-      <w:r>
-        <w:rPr>
-          <w:i/>
-          <w:iCs/>
-        </w:rPr>
-        <w:t>cards</w:t>
-      </w:r>
-      <w:proofErr w:type="spellEnd"/>
-      <w:r>
-        <w:t xml:space="preserve">), optimizando el espacio y facilitando la interacción táctil </w:t>
-      </w:r>
-    </w:p>
-    <w:p>
-      <w:pPr>
-        <w:ind w:left="720"/>
-        <w:rPr>
-          <w:b/>
-          <w:bCs/>
-        </w:rPr>
-      </w:pPr>
-      <w:r>
-        <w:rPr>
-          <w:b/>
-          <w:bCs/>
-        </w:rPr>
-        <w:drawing>
-          <wp:inline distT="0" distB="0" distL="0" distR="0" wp14:anchorId="03890655" wp14:editId="312F178C">
-            <wp:extent cx="1211580" cy="2000250"/>
-            <wp:effectExtent l="0" t="0" r="7620" b="0"/>
-            <wp:docPr id="1305797105" name="Picture 1"/>
-            <wp:cNvGraphicFramePr>
-              <a:graphicFrameLocks xmlns:a="http://schemas.openxmlformats.org/drawingml/2006/main" noChangeAspect="1"/>
-            </wp:cNvGraphicFramePr>
-            <a:graphic xmlns:a="http://schemas.openxmlformats.org/drawingml/2006/main">
-              <a:graphicData uri="http://schemas.openxmlformats.org/drawingml/2006/picture">
-                <pic:pic xmlns:pic="http://schemas.openxmlformats.org/drawingml/2006/picture">
-                  <pic:nvPicPr>
-                    <pic:cNvPr id="1305797105" name=""/>
-                    <pic:cNvPicPr/>
-                  </pic:nvPicPr>
-                  <pic:blipFill>
-                    <a:blip r:embed="rId8" cstate="print">
-                      <a:extLst>
-                        <a:ext uri="{28A0092B-C50C-407E-A947-70E740481C1C}">
-                          <a14:useLocalDpi xmlns:a14="http://schemas.microsoft.com/office/drawing/2010/main" val="0"/>
-                        </a:ext>
-                      </a:extLst>
-                    </a:blip>
-                    <a:stretch>
-                      <a:fillRect/>
-                    </a:stretch>
-                  </pic:blipFill>
-                  <pic:spPr>
-                    <a:xfrm>
-                      <a:off x="0" y="0"/>
-                      <a:ext cx="1211580" cy="2000250"/>
-                    </a:xfrm>
-                    <a:prstGeom prst="rect">
-                      <a:avLst/>
-                    </a:prstGeom>
-                  </pic:spPr>
-                </pic:pic>
-              </a:graphicData>
-            </a:graphic>
-          </wp:inline>
-        </w:drawing>
-      </w:r>
-    </w:p>
-    <w:p>
-      <w:pPr>
-        <w:rPr>
-          <w:b/>
-          <w:bCs/>
-        </w:rPr>
-      </w:pPr>
-      <w:r>
-        <w:rPr>
-          <w:b/>
-          <w:bCs/>
-        </w:rPr>
-        <w:br w:type="page"/>
-      </w:r>
-    </w:p>
-    <w:p>
-      <w:pPr>
-        <w:rPr>
-          <w:b/>
-          <w:bCs/>
-        </w:rPr>
-      </w:pPr>
-      <w:r>
-        <w:rPr>
-          <w:b/>
-          <w:bCs/>
-        </w:rPr>
-        <w:lastRenderedPageBreak/>
-        <w:t>4.2. Registro de Nueva Cotización</w:t>
-      </w:r>
-    </w:p>
-    <w:p>
-      <w:r>
-        <w:drawing>
-          <wp:anchor distT="0" distB="0" distL="114300" distR="114300" simplePos="0" relativeHeight="251665408" behindDoc="0" locked="0" layoutInCell="1" allowOverlap="1" wp14:anchorId="3950A512" wp14:editId="7993ABB4">
-            <wp:simplePos x="0" y="0"/>
-            <wp:positionH relativeFrom="column">
-              <wp:posOffset>1945005</wp:posOffset>
-            </wp:positionH>
-            <wp:positionV relativeFrom="paragraph">
-              <wp:posOffset>10160</wp:posOffset>
-            </wp:positionV>
-            <wp:extent cx="4398010" cy="1737360"/>
-            <wp:effectExtent l="0" t="0" r="2540" b="0"/>
-            <wp:wrapSquare wrapText="bothSides"/>
-            <wp:docPr id="1335814802" name="Picture 1"/>
-            <wp:cNvGraphicFramePr>
-              <a:graphicFrameLocks xmlns:a="http://schemas.openxmlformats.org/drawingml/2006/main" noChangeAspect="1"/>
-            </wp:cNvGraphicFramePr>
-            <a:graphic xmlns:a="http://schemas.openxmlformats.org/drawingml/2006/main">
-              <a:graphicData uri="http://schemas.openxmlformats.org/drawingml/2006/picture">
-                <pic:pic xmlns:pic="http://schemas.openxmlformats.org/drawingml/2006/picture">
-                  <pic:nvPicPr>
-                    <pic:cNvPr id="1335814802" name=""/>
-                    <pic:cNvPicPr/>
-                  </pic:nvPicPr>
-                  <pic:blipFill>
-                    <a:blip r:embed="rId9" cstate="print">
-                      <a:extLst>
-                        <a:ext uri="{28A0092B-C50C-407E-A947-70E740481C1C}">
-                          <a14:useLocalDpi xmlns:a14="http://schemas.microsoft.com/office/drawing/2010/main" val="0"/>
-                        </a:ext>
-                      </a:extLst>
-                    </a:blip>
-                    <a:stretch>
-                      <a:fillRect/>
-                    </a:stretch>
-                  </pic:blipFill>
-                  <pic:spPr>
-                    <a:xfrm>
-                      <a:off x="0" y="0"/>
-                      <a:ext cx="4398010" cy="1737360"/>
-                    </a:xfrm>
-                    <a:prstGeom prst="rect">
-                      <a:avLst/>
-                    </a:prstGeom>
-                  </pic:spPr>
-                </pic:pic>
-              </a:graphicData>
-            </a:graphic>
-            <wp14:sizeRelH relativeFrom="margin">
-              <wp14:pctWidth>0</wp14:pctWidth>
-            </wp14:sizeRelH>
-            <wp14:sizeRelV relativeFrom="margin">
-              <wp14:pctHeight>0</wp14:pctHeight>
-            </wp14:sizeRelV>
-          </wp:anchor>
-        </w:drawing>
-      </w:r>
-      <w:r>
-        <w:t>Para crear un nuevo presupuesto, inicie el formulario de registro. Deberá completar las siguientes secciones estructuradas:</w:t>
-      </w:r>
-    </w:p>
-    <w:p/>
-    <w:p>
-      <w:pPr>
-        <w:numPr>
-          <w:ilvl w:val="0"/>
-          <w:numId w:val="11"/>
-        </w:numPr>
-      </w:pPr>
-      <w:r>
-        <w:rPr>
-          <w:b/>
-          <w:bCs/>
-        </w:rPr>
-        <w:t>Información del Cliente:</w:t>
-      </w:r>
-      <w:r>
-        <w:t xml:space="preserve"> Ingrese los datos básicos de contacto e identificación de la persona que solicita el presupuesto.</w:t>
-      </w:r>
-    </w:p>
-    <w:p>
-      <w:pPr>
-        <w:numPr>
-          <w:ilvl w:val="0"/>
-          <w:numId w:val="11"/>
-        </w:numPr>
-      </w:pPr>
-      <w:r>
-        <w:rPr>
-          <w:b/>
-          <w:bCs/>
-        </w:rPr>
-        <w:t>Motivo de Ingreso:</w:t>
-      </w:r>
-      <w:r>
-        <w:t xml:space="preserve"> Describa la razón principal por la cual el vehículo requiere atención en el taller.</w:t>
-      </w:r>
-    </w:p>
-    <w:p>
-      <w:pPr>
-        <w:numPr>
-          <w:ilvl w:val="0"/>
-          <w:numId w:val="11"/>
-        </w:numPr>
-      </w:pPr>
-      <w:r>
-        <w:rPr>
-          <w:b/>
-          <w:bCs/>
-        </w:rPr>
-        <w:t>Servicios e Insumos:</w:t>
-      </w:r>
-      <w:r>
-        <w:t xml:space="preserve"> Agregue y detalle los ítems específicos de la atención. El sistema permite registrar por separado conceptos como la mano de obra mecánica y los insumos requeridos (por ejemplo, litros de aceite o repuestos).</w:t>
-      </w:r>
-    </w:p>
-    <w:p>
-      <w:pPr>
-        <w:numPr>
-          <w:ilvl w:val="0"/>
-          <w:numId w:val="11"/>
-        </w:numPr>
-      </w:pPr>
-      <w:r>
-        <w:rPr>
-          <w:b/>
-          <w:bCs/>
-        </w:rPr>
-        <w:t>Desglose Financiero:</w:t>
-      </w:r>
-      <w:r>
-        <w:t xml:space="preserve"> Al ingresar los valores, el sistema estructurará los costos. En este paso podrá aplicar </w:t>
-      </w:r>
-      <w:r>
-        <w:rPr>
-          <w:b/>
-          <w:bCs/>
-        </w:rPr>
-        <w:t>descuentos</w:t>
-      </w:r>
-      <w:r>
-        <w:t xml:space="preserve"> si la gerencia lo autoriza, y visualizar el cálculo automático del </w:t>
-      </w:r>
-      <w:r>
-        <w:rPr>
-          <w:b/>
-          <w:bCs/>
-        </w:rPr>
-        <w:t>IVA</w:t>
-      </w:r>
-      <w:r>
-        <w:t xml:space="preserve"> junto con el </w:t>
-      </w:r>
-      <w:r>
-        <w:rPr>
-          <w:b/>
-          <w:bCs/>
-        </w:rPr>
-        <w:t>Total</w:t>
-      </w:r>
-      <w:r>
-        <w:t xml:space="preserve"> final.</w:t>
-      </w:r>
-    </w:p>
-    <w:p>
-      <w:pPr>
-        <w:rPr>
-          <w:b/>
-          <w:bCs/>
-        </w:rPr>
-      </w:pPr>
-      <w:r>
-        <w:rPr>
-          <w:b/>
-          <w:bCs/>
-        </w:rPr>
-        <w:br w:type="page"/>
-      </w:r>
-    </w:p>
-    <w:p>
-      <w:pPr>
-        <w:rPr>
-          <w:b/>
-          <w:bCs/>
-        </w:rPr>
-      </w:pPr>
-      <w:r>
-        <w:lastRenderedPageBreak/>
-        <w:drawing>
-          <wp:anchor distT="0" distB="0" distL="114300" distR="114300" simplePos="0" relativeHeight="251661312" behindDoc="0" locked="0" layoutInCell="1" allowOverlap="1" wp14:anchorId="64B16079" wp14:editId="54E1E825">
-            <wp:simplePos x="0" y="0"/>
-            <wp:positionH relativeFrom="column">
-              <wp:posOffset>2242185</wp:posOffset>
-            </wp:positionH>
-            <wp:positionV relativeFrom="paragraph">
-              <wp:posOffset>136525</wp:posOffset>
-            </wp:positionV>
-            <wp:extent cx="3566160" cy="1885167"/>
-            <wp:effectExtent l="0" t="0" r="0" b="1270"/>
-            <wp:wrapSquare wrapText="bothSides"/>
-            <wp:docPr id="1940712762" name="Picture 1"/>
-            <wp:cNvGraphicFramePr>
-              <a:graphicFrameLocks xmlns:a="http://schemas.openxmlformats.org/drawingml/2006/main" noChangeAspect="1"/>
-            </wp:cNvGraphicFramePr>
-            <a:graphic xmlns:a="http://schemas.openxmlformats.org/drawingml/2006/main">
-              <a:graphicData uri="http://schemas.openxmlformats.org/drawingml/2006/picture">
-                <pic:pic xmlns:pic="http://schemas.openxmlformats.org/drawingml/2006/picture">
-                  <pic:nvPicPr>
-                    <pic:cNvPr id="1940712762" name=""/>
-                    <pic:cNvPicPr/>
-                  </pic:nvPicPr>
-                  <pic:blipFill>
-                    <a:blip r:embed="rId10" cstate="print">
-                      <a:extLst>
-                        <a:ext uri="{28A0092B-C50C-407E-A947-70E740481C1C}">
-                          <a14:useLocalDpi xmlns:a14="http://schemas.microsoft.com/office/drawing/2010/main" val="0"/>
-                        </a:ext>
-                      </a:extLst>
-                    </a:blip>
-                    <a:stretch>
-                      <a:fillRect/>
-                    </a:stretch>
-                  </pic:blipFill>
-                  <pic:spPr>
-                    <a:xfrm>
-                      <a:off x="0" y="0"/>
-                      <a:ext cx="3566160" cy="1885167"/>
-                    </a:xfrm>
-                    <a:prstGeom prst="rect">
-                      <a:avLst/>
-                    </a:prstGeom>
-                  </pic:spPr>
-                </pic:pic>
-              </a:graphicData>
-            </a:graphic>
-          </wp:anchor>
-        </w:drawing>
-      </w:r>
-      <w:r>
-        <w:rPr>
-          <w:b/>
-          <w:bCs/>
-        </w:rPr>
-        <w:t>4.3. Vista de Detalle y Gestión</w:t>
-      </w:r>
-    </w:p>
-    <w:p>
-      <w:r>
-        <w:t xml:space="preserve">Una vez guardada, al seleccionar una cotización desde el listado, accederá a la </w:t>
-      </w:r>
-      <w:r>
-        <w:rPr>
-          <w:b/>
-          <w:bCs/>
-        </w:rPr>
-        <w:t>Vista de Detalle</w:t>
-      </w:r>
-      <w:r>
-        <w:t>. Esta pantalla muestra un resumen estático de la información general y habilita un panel de acciones rápidas para gestionar el documento:</w:t>
-      </w:r>
-    </w:p>
-    <w:p>
-      <w:pPr>
-        <w:jc w:val="center"/>
-      </w:pPr>
-    </w:p>
-    <w:p>
-      <w:pPr>
-        <w:numPr>
-          <w:ilvl w:val="0"/>
-          <w:numId w:val="12"/>
-        </w:numPr>
-      </w:pPr>
-      <w:r>
-        <w:drawing>
-          <wp:anchor distT="0" distB="0" distL="114300" distR="114300" simplePos="0" relativeHeight="251660288" behindDoc="0" locked="0" layoutInCell="1" allowOverlap="1" wp14:anchorId="785EF335" wp14:editId="51090298">
-            <wp:simplePos x="0" y="0"/>
-            <wp:positionH relativeFrom="column">
-              <wp:posOffset>3141345</wp:posOffset>
-            </wp:positionH>
-            <wp:positionV relativeFrom="paragraph">
-              <wp:posOffset>429895</wp:posOffset>
-            </wp:positionV>
-            <wp:extent cx="2305050" cy="352425"/>
-            <wp:effectExtent l="0" t="0" r="0" b="9525"/>
-            <wp:wrapSquare wrapText="bothSides"/>
-            <wp:docPr id="2081551488" name="Picture 1"/>
-            <wp:cNvGraphicFramePr>
-              <a:graphicFrameLocks xmlns:a="http://schemas.openxmlformats.org/drawingml/2006/main" noChangeAspect="1"/>
-            </wp:cNvGraphicFramePr>
-            <a:graphic xmlns:a="http://schemas.openxmlformats.org/drawingml/2006/main">
-              <a:graphicData uri="http://schemas.openxmlformats.org/drawingml/2006/picture">
-                <pic:pic xmlns:pic="http://schemas.openxmlformats.org/drawingml/2006/picture">
-                  <pic:nvPicPr>
-                    <pic:cNvPr id="2081551488" name=""/>
-                    <pic:cNvPicPr/>
-                  </pic:nvPicPr>
-                  <pic:blipFill>
-                    <a:blip r:embed="rId11">
-                      <a:extLst>
-                        <a:ext uri="{28A0092B-C50C-407E-A947-70E740481C1C}">
-                          <a14:useLocalDpi xmlns:a14="http://schemas.microsoft.com/office/drawing/2010/main" val="0"/>
-                        </a:ext>
-                      </a:extLst>
-                    </a:blip>
-                    <a:stretch>
-                      <a:fillRect/>
-                    </a:stretch>
-                  </pic:blipFill>
-                  <pic:spPr>
-                    <a:xfrm>
-                      <a:off x="0" y="0"/>
-                      <a:ext cx="2305050" cy="352425"/>
-                    </a:xfrm>
-                    <a:prstGeom prst="rect">
-                      <a:avLst/>
-                    </a:prstGeom>
-                  </pic:spPr>
-                </pic:pic>
-              </a:graphicData>
-            </a:graphic>
-          </wp:anchor>
-        </w:drawing>
-      </w:r>
-      <w:r>
-        <w:rPr>
-          <w:b/>
-          <w:bCs/>
-        </w:rPr>
-        <w:t>Editar (Rehacer):</w:t>
-      </w:r>
-      <w:r>
-        <w:t xml:space="preserve"> Permite ingresar nuevamente al formulario para modificar valores, agregar servicios o corregir datos del cliente. </w:t>
-      </w:r>
-      <w:r>
-        <w:rPr>
-          <w:i/>
-          <w:iCs/>
-        </w:rPr>
-        <w:t>Nota operativa:</w:t>
-      </w:r>
-      <w:r>
-        <w:t xml:space="preserve"> Esta acción solo está disponible en la fase de presupuesto. Una vez que la cotización se confirma y avanza en el flujo, su edición se bloquea por seguridad.</w:t>
-      </w:r>
-      <w:r>
-        <w:rPr>
-          <w:noProof/>
-        </w:rPr>
-        <w:t xml:space="preserve"> </w:t>
-      </w:r>
-    </w:p>
-    <w:p>
-      <w:pPr>
-        <w:numPr>
-          <w:ilvl w:val="0"/>
-          <w:numId w:val="12"/>
-        </w:numPr>
-      </w:pPr>
-      <w:r>
-        <w:drawing>
-          <wp:anchor distT="0" distB="0" distL="114300" distR="114300" simplePos="0" relativeHeight="251659264" behindDoc="0" locked="0" layoutInCell="1" allowOverlap="1" wp14:anchorId="7DBF4F04" wp14:editId="740F5714">
-            <wp:simplePos x="0" y="0"/>
-            <wp:positionH relativeFrom="column">
-              <wp:posOffset>3369945</wp:posOffset>
-            </wp:positionH>
-            <wp:positionV relativeFrom="paragraph">
-              <wp:posOffset>226060</wp:posOffset>
-            </wp:positionV>
-            <wp:extent cx="2017395" cy="356870"/>
-            <wp:effectExtent l="0" t="0" r="1905" b="5080"/>
-            <wp:wrapSquare wrapText="bothSides"/>
-            <wp:docPr id="506455732" name="Picture 1"/>
-            <wp:cNvGraphicFramePr>
-              <a:graphicFrameLocks xmlns:a="http://schemas.openxmlformats.org/drawingml/2006/main" noChangeAspect="1"/>
-            </wp:cNvGraphicFramePr>
-            <a:graphic xmlns:a="http://schemas.openxmlformats.org/drawingml/2006/main">
-              <a:graphicData uri="http://schemas.openxmlformats.org/drawingml/2006/picture">
-                <pic:pic xmlns:pic="http://schemas.openxmlformats.org/drawingml/2006/picture">
-                  <pic:nvPicPr>
-                    <pic:cNvPr id="506455732" name=""/>
-                    <pic:cNvPicPr/>
-                  </pic:nvPicPr>
-                  <pic:blipFill>
-                    <a:blip r:embed="rId12">
-                      <a:extLst>
-                        <a:ext uri="{28A0092B-C50C-407E-A947-70E740481C1C}">
-                          <a14:useLocalDpi xmlns:a14="http://schemas.microsoft.com/office/drawing/2010/main" val="0"/>
-                        </a:ext>
-                      </a:extLst>
-                    </a:blip>
-                    <a:stretch>
-                      <a:fillRect/>
-                    </a:stretch>
-                  </pic:blipFill>
-                  <pic:spPr>
-                    <a:xfrm>
-                      <a:off x="0" y="0"/>
-                      <a:ext cx="2017395" cy="356870"/>
-                    </a:xfrm>
-                    <a:prstGeom prst="rect">
-                      <a:avLst/>
-                    </a:prstGeom>
-                  </pic:spPr>
-                </pic:pic>
-              </a:graphicData>
-            </a:graphic>
-            <wp14:sizeRelH relativeFrom="margin">
-              <wp14:pctWidth>0</wp14:pctWidth>
-            </wp14:sizeRelH>
-            <wp14:sizeRelV relativeFrom="margin">
-              <wp14:pctHeight>0</wp14:pctHeight>
-            </wp14:sizeRelV>
-          </wp:anchor>
-        </w:drawing>
-      </w:r>
-      <w:r>
-        <w:rPr>
-          <w:b/>
-          <w:bCs/>
-        </w:rPr>
-        <w:t>Descargar PDF:</w:t>
-      </w:r>
-      <w:r>
-        <w:t xml:space="preserve"> Genera instantáneamente un documento formal en formato PDF con el desglose del presupuesto, listo para ser descargado y enviado al cliente.</w:t>
-      </w:r>
-      <w:r>
-        <w:rPr>
-          <w:noProof/>
-        </w:rPr>
-        <w:t xml:space="preserve"> </w:t>
-      </w:r>
-    </w:p>
-    <w:p>
-      <w:pPr>
-        <w:numPr>
-          <w:ilvl w:val="0"/>
-          <w:numId w:val="12"/>
-        </w:numPr>
-      </w:pPr>
-      <w:r>
-        <w:drawing>
-          <wp:anchor distT="0" distB="0" distL="114300" distR="114300" simplePos="0" relativeHeight="251662336" behindDoc="0" locked="0" layoutInCell="1" allowOverlap="1" wp14:anchorId="7F11AA5B" wp14:editId="5D0B0DE7">
-            <wp:simplePos x="0" y="0"/>
-            <wp:positionH relativeFrom="column">
-              <wp:posOffset>3160395</wp:posOffset>
-            </wp:positionH>
-            <wp:positionV relativeFrom="paragraph">
-              <wp:posOffset>106045</wp:posOffset>
-            </wp:positionV>
-            <wp:extent cx="2286000" cy="323850"/>
-            <wp:effectExtent l="0" t="0" r="0" b="0"/>
-            <wp:wrapSquare wrapText="bothSides"/>
-            <wp:docPr id="1742506653" name="Picture 1"/>
-            <wp:cNvGraphicFramePr>
-              <a:graphicFrameLocks xmlns:a="http://schemas.openxmlformats.org/drawingml/2006/main" noChangeAspect="1"/>
-            </wp:cNvGraphicFramePr>
-            <a:graphic xmlns:a="http://schemas.openxmlformats.org/drawingml/2006/main">
-              <a:graphicData uri="http://schemas.openxmlformats.org/drawingml/2006/picture">
-                <pic:pic xmlns:pic="http://schemas.openxmlformats.org/drawingml/2006/picture">
-                  <pic:nvPicPr>
-                    <pic:cNvPr id="1742506653" name=""/>
-                    <pic:cNvPicPr/>
-                  </pic:nvPicPr>
-                  <pic:blipFill>
-                    <a:blip r:embed="rId13">
-                      <a:extLst>
-                        <a:ext uri="{28A0092B-C50C-407E-A947-70E740481C1C}">
-                          <a14:useLocalDpi xmlns:a14="http://schemas.microsoft.com/office/drawing/2010/main" val="0"/>
-                        </a:ext>
-                      </a:extLst>
-                    </a:blip>
-                    <a:stretch>
-                      <a:fillRect/>
-                    </a:stretch>
-                  </pic:blipFill>
-                  <pic:spPr>
-                    <a:xfrm>
-                      <a:off x="0" y="0"/>
-                      <a:ext cx="2286000" cy="323850"/>
-                    </a:xfrm>
-                    <a:prstGeom prst="rect">
-                      <a:avLst/>
-                    </a:prstGeom>
-                  </pic:spPr>
-                </pic:pic>
-              </a:graphicData>
-            </a:graphic>
-          </wp:anchor>
-        </w:drawing>
-      </w:r>
-      <w:r>
-        <w:drawing>
-          <wp:anchor distT="0" distB="0" distL="114300" distR="114300" simplePos="0" relativeHeight="251658240" behindDoc="0" locked="0" layoutInCell="1" allowOverlap="1" wp14:anchorId="4551BF3E" wp14:editId="3938D8CC">
-            <wp:simplePos x="0" y="0"/>
-            <wp:positionH relativeFrom="column">
-              <wp:posOffset>3430936</wp:posOffset>
-            </wp:positionH>
-            <wp:positionV relativeFrom="paragraph">
-              <wp:posOffset>560705</wp:posOffset>
-            </wp:positionV>
-            <wp:extent cx="1889760" cy="2573062"/>
-            <wp:effectExtent l="0" t="0" r="0" b="0"/>
-            <wp:wrapSquare wrapText="bothSides"/>
-            <wp:docPr id="541097848" name="Picture 1"/>
-            <wp:cNvGraphicFramePr>
-              <a:graphicFrameLocks xmlns:a="http://schemas.openxmlformats.org/drawingml/2006/main" noChangeAspect="1"/>
-            </wp:cNvGraphicFramePr>
-            <a:graphic xmlns:a="http://schemas.openxmlformats.org/drawingml/2006/main">
-              <a:graphicData uri="http://schemas.openxmlformats.org/drawingml/2006/picture">
-                <pic:pic xmlns:pic="http://schemas.openxmlformats.org/drawingml/2006/picture">
-                  <pic:nvPicPr>
-                    <pic:cNvPr id="541097848" name=""/>
-                    <pic:cNvPicPr/>
-                  </pic:nvPicPr>
-                  <pic:blipFill>
-                    <a:blip r:embed="rId14" cstate="print">
-                      <a:extLst>
-                        <a:ext uri="{28A0092B-C50C-407E-A947-70E740481C1C}">
-                          <a14:useLocalDpi xmlns:a14="http://schemas.microsoft.com/office/drawing/2010/main" val="0"/>
-                        </a:ext>
-                      </a:extLst>
-                    </a:blip>
-                    <a:stretch>
-                      <a:fillRect/>
-                    </a:stretch>
-                  </pic:blipFill>
-                  <pic:spPr>
-                    <a:xfrm>
-                      <a:off x="0" y="0"/>
-                      <a:ext cx="1889760" cy="2573062"/>
-                    </a:xfrm>
-                    <a:prstGeom prst="rect">
-                      <a:avLst/>
-                    </a:prstGeom>
-                  </pic:spPr>
-                </pic:pic>
-              </a:graphicData>
-            </a:graphic>
-          </wp:anchor>
-        </w:drawing>
-      </w:r>
-      <w:r>
-        <w:rPr>
-          <w:b/>
-          <w:bCs/>
-        </w:rPr>
-        <w:t>Confirmar Cotización:</w:t>
-      </w:r>
-      <w:r>
-        <w:t xml:space="preserve"> Esta es la acción que aprueba el presupuesto y da inicio al ciclo operativo. Al confirmarla, el sistema abrirá un paso intermedio solicitando información adicional del cliente para transformar esta cotización directamente en una </w:t>
-      </w:r>
-      <w:r>
-        <w:rPr>
-          <w:b/>
-          <w:bCs/>
-        </w:rPr>
-        <w:t>Ficha de Trabajo</w:t>
-      </w:r>
-      <w:r>
-        <w:t xml:space="preserve"> oficial.</w:t>
-      </w:r>
-    </w:p>
-    <w:p>
-      <w:pPr>
-        <w:ind w:left="360"/>
-      </w:pPr>
-    </w:p>
-    <w:p>
-      <w:r>
-        <w:br w:type="page"/>
-      </w:r>
-    </w:p>
-    <w:p>
-      <w:pPr>
-        <w:rPr>
-          <w:b/>
-          <w:bCs/>
-        </w:rPr>
-      </w:pPr>
-      <w:r>
-        <w:rPr>
-          <w:b/>
-          <w:bCs/>
-        </w:rPr>
-        <w:lastRenderedPageBreak/>
-        <w:t>5. Módulo de Fichas de Trabajo</w:t>
-      </w:r>
-    </w:p>
-    <w:p>
-      <w:r>
-        <w:t>Este módulo representa el núcleo operativo de Neutro Transmisiones. Aquí se centraliza, documenta y gestiona toda la información del vehículo desde que ingresa a las instalaciones hasta que es devuelto al cliente.</w:t>
-      </w:r>
-    </w:p>
-    <w:p>
-      <w:pPr>
-        <w:rPr>
-          <w:b/>
-          <w:bCs/>
-        </w:rPr>
-      </w:pPr>
-      <w:r>
-        <w:rPr>
-          <w:b/>
-          <w:bCs/>
-        </w:rPr>
-        <w:t>5.1. Creación y Listado de Fichas</w:t>
-      </w:r>
-    </w:p>
-    <w:p>
-      <w:r>
-        <w:t>Una Ficha de Trabajo puede originarse de dos maneras distintas en el sistema:</w:t>
-      </w:r>
-    </w:p>
-    <w:p>
-      <w:pPr>
-        <w:numPr>
-          <w:ilvl w:val="0"/>
-          <w:numId w:val="13"/>
-        </w:numPr>
-      </w:pPr>
-      <w:r>
-        <w:rPr>
-          <w:b/>
-          <w:bCs/>
-        </w:rPr>
-        <w:t>Desde una Cotización Inicial:</w:t>
-      </w:r>
-      <w:r>
-        <w:t xml:space="preserve"> Al confirmar un presupuesto previo, el sistema migra los datos iniciales y solicita la información restante para abrir la ficha formalmente.</w:t>
-      </w:r>
-    </w:p>
-    <w:p>
-      <w:pPr>
-        <w:numPr>
-          <w:ilvl w:val="0"/>
-          <w:numId w:val="13"/>
-        </w:numPr>
-      </w:pPr>
-      <w:r>
-        <w:rPr>
-          <w:b/>
-          <w:bCs/>
-        </w:rPr>
-        <w:t>Creación Manual:</w:t>
-      </w:r>
-      <w:r>
-        <w:t xml:space="preserve"> A través del botón de nueva ficha, donde se despliega un formulario directo que requiere ingresar la información detallada del cliente y el motivo exacto de ingreso del vehículo.</w:t>
-      </w:r>
-    </w:p>
-    <w:p>
-      <w:r>
-        <w:drawing>
-          <wp:anchor distT="0" distB="0" distL="114300" distR="114300" simplePos="0" relativeHeight="251666432" behindDoc="0" locked="0" layoutInCell="1" allowOverlap="1" wp14:anchorId="4E1440EF" wp14:editId="59011E0E">
+          <wp:anchor distT="0" distB="0" distL="114300" distR="114300" simplePos="0" relativeHeight="251666432" behindDoc="0" locked="0" layoutInCell="1" allowOverlap="1" wp14:anchorId="4E1440EF" wp14:editId="02822955">
             <wp:simplePos x="0" y="0"/>
             <wp:positionH relativeFrom="column">
               <wp:posOffset>2394585</wp:posOffset>
@@ -1473,7 +632,7 @@
                     <pic:cNvPicPr/>
                   </pic:nvPicPr>
                   <pic:blipFill>
-                    <a:blip r:embed="rId15" cstate="print">
+                    <a:blip r:embed="rId7" cstate="print">
                       <a:extLst>
                         <a:ext uri="{28A0092B-C50C-407E-A947-70E740481C1C}">
                           <a14:useLocalDpi xmlns:a14="http://schemas.microsoft.com/office/drawing/2010/main" val="0"/>
@@ -1535,6 +694,9 @@
         </w:numPr>
       </w:pPr>
       <w:r>
+        <w:rPr>
+          <w:noProof/>
+        </w:rPr>
         <w:drawing>
           <wp:anchor distT="0" distB="0" distL="114300" distR="114300" simplePos="0" relativeHeight="251667456" behindDoc="0" locked="0" layoutInCell="1" allowOverlap="1" wp14:anchorId="259ABAF1" wp14:editId="7C83639E">
             <wp:simplePos x="0" y="0"/>
@@ -1559,7 +721,7 @@
                     <pic:cNvPicPr/>
                   </pic:nvPicPr>
                   <pic:blipFill>
-                    <a:blip r:embed="rId16">
+                    <a:blip r:embed="rId8">
                       <a:extLst>
                         <a:ext uri="{28A0092B-C50C-407E-A947-70E740481C1C}">
                           <a14:useLocalDpi xmlns:a14="http://schemas.microsoft.com/office/drawing/2010/main" val="0"/>
@@ -1615,6 +777,9 @@
         </w:rPr>
       </w:pPr>
       <w:r>
+        <w:rPr>
+          <w:noProof/>
+        </w:rPr>
         <w:lastRenderedPageBreak/>
         <w:drawing>
           <wp:anchor distT="0" distB="0" distL="114300" distR="114300" simplePos="0" relativeHeight="251668480" behindDoc="0" locked="0" layoutInCell="1" allowOverlap="1" wp14:anchorId="658EFF02" wp14:editId="0B1A4376">
@@ -1640,7 +805,7 @@
                     <pic:cNvPicPr/>
                   </pic:nvPicPr>
                   <pic:blipFill>
-                    <a:blip r:embed="rId17">
+                    <a:blip r:embed="rId9">
                       <a:extLst>
                         <a:ext uri="{28A0092B-C50C-407E-A947-70E740481C1C}">
                           <a14:useLocalDpi xmlns:a14="http://schemas.microsoft.com/office/drawing/2010/main" val="0"/>
@@ -1818,6 +983,9 @@
         </w:rPr>
       </w:pPr>
       <w:r>
+        <w:rPr>
+          <w:noProof/>
+        </w:rPr>
         <w:drawing>
           <wp:inline distT="0" distB="0" distL="0" distR="0" wp14:anchorId="69BC5385" wp14:editId="25AD7AB6">
             <wp:extent cx="5612130" cy="598170"/>
@@ -1834,7 +1002,7 @@
                     <pic:cNvPicPr/>
                   </pic:nvPicPr>
                   <pic:blipFill>
-                    <a:blip r:embed="rId18"/>
+                    <a:blip r:embed="rId10"/>
                     <a:stretch>
                       <a:fillRect/>
                     </a:stretch>
@@ -1857,6 +1025,9 @@
     </w:p>
     <w:p>
       <w:r>
+        <w:rPr>
+          <w:noProof/>
+        </w:rPr>
         <w:drawing>
           <wp:anchor distT="0" distB="0" distL="114300" distR="114300" simplePos="0" relativeHeight="251669504" behindDoc="0" locked="0" layoutInCell="1" allowOverlap="1" wp14:anchorId="7450BF2C" wp14:editId="39E4E5B1">
             <wp:simplePos x="0" y="0"/>
@@ -1881,7 +1052,7 @@
                     <pic:cNvPicPr/>
                   </pic:nvPicPr>
                   <pic:blipFill>
-                    <a:blip r:embed="rId19">
+                    <a:blip r:embed="rId11">
                       <a:extLst>
                         <a:ext uri="{28A0092B-C50C-407E-A947-70E740481C1C}">
                           <a14:useLocalDpi xmlns:a14="http://schemas.microsoft.com/office/drawing/2010/main" val="0"/>
@@ -1970,6 +1141,9 @@
         </w:rPr>
       </w:pPr>
       <w:r>
+        <w:rPr>
+          <w:noProof/>
+        </w:rPr>
         <w:lastRenderedPageBreak/>
         <w:drawing>
           <wp:anchor distT="0" distB="0" distL="114300" distR="114300" simplePos="0" relativeHeight="251670528" behindDoc="0" locked="0" layoutInCell="1" allowOverlap="1" wp14:anchorId="1195D076" wp14:editId="61A6CB77">
@@ -1995,7 +1169,7 @@
                     <pic:cNvPicPr/>
                   </pic:nvPicPr>
                   <pic:blipFill>
-                    <a:blip r:embed="rId20">
+                    <a:blip r:embed="rId12">
                       <a:extLst>
                         <a:ext uri="{28A0092B-C50C-407E-A947-70E740481C1C}">
                           <a14:useLocalDpi xmlns:a14="http://schemas.microsoft.com/office/drawing/2010/main" val="0"/>
@@ -2114,6 +1288,7 @@
         <w:rPr>
           <w:b/>
           <w:bCs/>
+          <w:noProof/>
         </w:rPr>
         <w:drawing>
           <wp:anchor distT="0" distB="0" distL="114300" distR="114300" simplePos="0" relativeHeight="251671552" behindDoc="0" locked="0" layoutInCell="1" allowOverlap="1" wp14:anchorId="29791084" wp14:editId="5459B7B1">
@@ -2139,7 +1314,7 @@
                     <pic:cNvPicPr/>
                   </pic:nvPicPr>
                   <pic:blipFill>
-                    <a:blip r:embed="rId21">
+                    <a:blip r:embed="rId13">
                       <a:extLst>
                         <a:ext uri="{28A0092B-C50C-407E-A947-70E740481C1C}">
                           <a14:useLocalDpi xmlns:a14="http://schemas.microsoft.com/office/drawing/2010/main" val="0"/>
@@ -2325,6 +1500,9 @@
     </w:p>
     <w:p>
       <w:r>
+        <w:rPr>
+          <w:noProof/>
+        </w:rPr>
         <w:drawing>
           <wp:anchor distT="0" distB="0" distL="114300" distR="114300" simplePos="0" relativeHeight="251672576" behindDoc="0" locked="0" layoutInCell="1" allowOverlap="1" wp14:anchorId="26BE6C27" wp14:editId="092484A3">
             <wp:simplePos x="0" y="0"/>
@@ -2349,7 +1527,7 @@
                     <pic:cNvPicPr/>
                   </pic:nvPicPr>
                   <pic:blipFill>
-                    <a:blip r:embed="rId22">
+                    <a:blip r:embed="rId14">
                       <a:extLst>
                         <a:ext uri="{28A0092B-C50C-407E-A947-70E740481C1C}">
                           <a14:useLocalDpi xmlns:a14="http://schemas.microsoft.com/office/drawing/2010/main" val="0"/>
@@ -2507,8 +1685,11 @@
         </w:rPr>
       </w:pPr>
       <w:r>
+        <w:rPr>
+          <w:noProof/>
+        </w:rPr>
         <w:drawing>
-          <wp:anchor distT="0" distB="0" distL="114300" distR="114300" simplePos="0" relativeHeight="251673600" behindDoc="0" locked="0" layoutInCell="1" allowOverlap="1" wp14:anchorId="6E439A01" wp14:editId="451C90A0">
+          <wp:anchor distT="0" distB="0" distL="114300" distR="114300" simplePos="0" relativeHeight="251673600" behindDoc="0" locked="0" layoutInCell="1" allowOverlap="1" wp14:anchorId="6E439A01" wp14:editId="56C945A8">
             <wp:simplePos x="0" y="0"/>
             <wp:positionH relativeFrom="column">
               <wp:posOffset>2813685</wp:posOffset>
@@ -2531,7 +1712,7 @@
                     <pic:cNvPicPr/>
                   </pic:nvPicPr>
                   <pic:blipFill>
-                    <a:blip r:embed="rId23" cstate="print">
+                    <a:blip r:embed="rId15" cstate="print">
                       <a:extLst>
                         <a:ext uri="{28A0092B-C50C-407E-A947-70E740481C1C}">
                           <a14:useLocalDpi xmlns:a14="http://schemas.microsoft.com/office/drawing/2010/main" val="0"/>
@@ -2762,8 +1943,11 @@
         </w:rPr>
       </w:pPr>
       <w:r>
+        <w:rPr>
+          <w:noProof/>
+        </w:rPr>
         <w:drawing>
-          <wp:anchor distT="0" distB="0" distL="114300" distR="114300" simplePos="0" relativeHeight="251674624" behindDoc="0" locked="0" layoutInCell="1" allowOverlap="1" wp14:anchorId="023E25F1" wp14:editId="70C80960">
+          <wp:anchor distT="0" distB="0" distL="114300" distR="114300" simplePos="0" relativeHeight="251674624" behindDoc="0" locked="0" layoutInCell="1" allowOverlap="1" wp14:anchorId="023E25F1" wp14:editId="28D38CB2">
             <wp:simplePos x="0" y="0"/>
             <wp:positionH relativeFrom="column">
               <wp:posOffset>2150745</wp:posOffset>
@@ -2786,7 +1970,7 @@
                     <pic:cNvPicPr/>
                   </pic:nvPicPr>
                   <pic:blipFill>
-                    <a:blip r:embed="rId24" cstate="print">
+                    <a:blip r:embed="rId16" cstate="print">
                       <a:extLst>
                         <a:ext uri="{28A0092B-C50C-407E-A947-70E740481C1C}">
                           <a14:useLocalDpi xmlns:a14="http://schemas.microsoft.com/office/drawing/2010/main" val="0"/>
@@ -3202,6 +2386,9 @@
     </w:p>
     <w:p>
       <w:r>
+        <w:rPr>
+          <w:noProof/>
+        </w:rPr>
         <w:drawing>
           <wp:anchor distT="0" distB="0" distL="114300" distR="114300" simplePos="0" relativeHeight="251675648" behindDoc="0" locked="0" layoutInCell="1" allowOverlap="1" wp14:anchorId="13E204CD" wp14:editId="50A24ACB">
             <wp:simplePos x="0" y="0"/>
@@ -3226,7 +2413,7 @@
                     <pic:cNvPicPr/>
                   </pic:nvPicPr>
                   <pic:blipFill>
-                    <a:blip r:embed="rId25">
+                    <a:blip r:embed="rId17">
                       <a:extLst>
                         <a:ext uri="{28A0092B-C50C-407E-A947-70E740481C1C}">
                           <a14:useLocalDpi xmlns:a14="http://schemas.microsoft.com/office/drawing/2010/main" val="0"/>
@@ -3338,6 +2525,9 @@
     </w:p>
     <w:p>
       <w:r>
+        <w:rPr>
+          <w:noProof/>
+        </w:rPr>
         <w:drawing>
           <wp:inline distT="0" distB="0" distL="0" distR="0" wp14:anchorId="056FB8F4" wp14:editId="62A217B6">
             <wp:extent cx="5463540" cy="3167380"/>
@@ -3354,7 +2544,7 @@
                     <pic:cNvPicPr/>
                   </pic:nvPicPr>
                   <pic:blipFill rotWithShape="1">
-                    <a:blip r:embed="rId26"/>
+                    <a:blip r:embed="rId18"/>
                     <a:srcRect r="2648"/>
                     <a:stretch>
                       <a:fillRect/>
@@ -3392,9 +2582,12 @@
         </w:rPr>
       </w:pPr>
       <w:r>
+        <w:rPr>
+          <w:noProof/>
+        </w:rPr>
         <w:lastRenderedPageBreak/>
         <w:drawing>
-          <wp:anchor distT="0" distB="0" distL="114300" distR="114300" simplePos="0" relativeHeight="251676672" behindDoc="0" locked="0" layoutInCell="1" allowOverlap="1" wp14:anchorId="3174D4EC" wp14:editId="769F3A5C">
+          <wp:anchor distT="0" distB="0" distL="114300" distR="114300" simplePos="0" relativeHeight="251676672" behindDoc="0" locked="0" layoutInCell="1" allowOverlap="1" wp14:anchorId="3174D4EC" wp14:editId="01D378F2">
             <wp:simplePos x="0" y="0"/>
             <wp:positionH relativeFrom="column">
               <wp:posOffset>2302510</wp:posOffset>
@@ -3417,7 +2610,7 @@
                     <pic:cNvPicPr/>
                   </pic:nvPicPr>
                   <pic:blipFill>
-                    <a:blip r:embed="rId27" cstate="print">
+                    <a:blip r:embed="rId19" cstate="print">
                       <a:extLst>
                         <a:ext uri="{28A0092B-C50C-407E-A947-70E740481C1C}">
                           <a14:useLocalDpi xmlns:a14="http://schemas.microsoft.com/office/drawing/2010/main" val="0"/>
@@ -3613,6 +2806,9 @@
         </w:rPr>
       </w:pPr>
       <w:r>
+        <w:rPr>
+          <w:noProof/>
+        </w:rPr>
         <w:drawing>
           <wp:anchor distT="0" distB="0" distL="114300" distR="114300" simplePos="0" relativeHeight="251677696" behindDoc="0" locked="0" layoutInCell="1" allowOverlap="1" wp14:anchorId="0C1992B8" wp14:editId="2C8A009D">
             <wp:simplePos x="0" y="0"/>
@@ -3637,7 +2833,7 @@
                     <pic:cNvPicPr/>
                   </pic:nvPicPr>
                   <pic:blipFill>
-                    <a:blip r:embed="rId28">
+                    <a:blip r:embed="rId20">
                       <a:extLst>
                         <a:ext uri="{28A0092B-C50C-407E-A947-70E740481C1C}">
                           <a14:useLocalDpi xmlns:a14="http://schemas.microsoft.com/office/drawing/2010/main" val="0"/>
@@ -3765,6 +2961,9 @@
         </w:numPr>
       </w:pPr>
       <w:r>
+        <w:rPr>
+          <w:noProof/>
+        </w:rPr>
         <w:drawing>
           <wp:anchor distT="0" distB="0" distL="114300" distR="114300" simplePos="0" relativeHeight="251678720" behindDoc="0" locked="0" layoutInCell="1" allowOverlap="1" wp14:anchorId="05AFA87D" wp14:editId="61FCE54B">
             <wp:simplePos x="0" y="0"/>
@@ -3789,7 +2988,7 @@
                     <pic:cNvPicPr/>
                   </pic:nvPicPr>
                   <pic:blipFill>
-                    <a:blip r:embed="rId29">
+                    <a:blip r:embed="rId21">
                       <a:extLst>
                         <a:ext uri="{28A0092B-C50C-407E-A947-70E740481C1C}">
                           <a14:useLocalDpi xmlns:a14="http://schemas.microsoft.com/office/drawing/2010/main" val="0"/>
@@ -3969,6 +3168,9 @@
         </mc:AlternateContent>
       </w:r>
       <w:r>
+        <w:rPr>
+          <w:noProof/>
+        </w:rPr>
         <w:drawing>
           <wp:anchor distT="0" distB="0" distL="114300" distR="114300" simplePos="0" relativeHeight="251679744" behindDoc="0" locked="0" layoutInCell="1" allowOverlap="1" wp14:anchorId="5CE1B8F6" wp14:editId="29E5DEB1">
             <wp:simplePos x="0" y="0"/>
@@ -3993,7 +3195,7 @@
                     <pic:cNvPicPr/>
                   </pic:nvPicPr>
                   <pic:blipFill>
-                    <a:blip r:embed="rId30">
+                    <a:blip r:embed="rId22">
                       <a:extLst>
                         <a:ext uri="{28A0092B-C50C-407E-A947-70E740481C1C}">
                           <a14:useLocalDpi xmlns:a14="http://schemas.microsoft.com/office/drawing/2010/main" val="0"/>
@@ -4084,9 +3286,12 @@
         </w:rPr>
       </w:pPr>
       <w:r>
+        <w:rPr>
+          <w:noProof/>
+        </w:rPr>
         <w:lastRenderedPageBreak/>
         <w:drawing>
-          <wp:anchor distT="0" distB="0" distL="114300" distR="114300" simplePos="0" relativeHeight="251681792" behindDoc="0" locked="0" layoutInCell="1" allowOverlap="1" wp14:anchorId="5E4436D3" wp14:editId="5A16AF6D">
+          <wp:anchor distT="0" distB="0" distL="114300" distR="114300" simplePos="0" relativeHeight="251681792" behindDoc="0" locked="0" layoutInCell="1" allowOverlap="1" wp14:anchorId="5E4436D3" wp14:editId="7B157918">
             <wp:simplePos x="0" y="0"/>
             <wp:positionH relativeFrom="page">
               <wp:posOffset>4328795</wp:posOffset>
@@ -4109,7 +3314,7 @@
                     <pic:cNvPicPr/>
                   </pic:nvPicPr>
                   <pic:blipFill>
-                    <a:blip r:embed="rId31" cstate="print">
+                    <a:blip r:embed="rId23" cstate="print">
                       <a:extLst>
                         <a:ext uri="{28A0092B-C50C-407E-A947-70E740481C1C}">
                           <a14:useLocalDpi xmlns:a14="http://schemas.microsoft.com/office/drawing/2010/main" val="0"/>
@@ -4225,8 +3430,11 @@
     </w:p>
     <w:p>
       <w:r>
+        <w:rPr>
+          <w:noProof/>
+        </w:rPr>
         <w:drawing>
-          <wp:anchor distT="0" distB="0" distL="114300" distR="114300" simplePos="0" relativeHeight="251682816" behindDoc="0" locked="0" layoutInCell="1" allowOverlap="1" wp14:anchorId="162708F9" wp14:editId="188FA76D">
+          <wp:anchor distT="0" distB="0" distL="114300" distR="114300" simplePos="0" relativeHeight="251682816" behindDoc="0" locked="0" layoutInCell="1" allowOverlap="1" wp14:anchorId="162708F9" wp14:editId="3BBA7489">
             <wp:simplePos x="0" y="0"/>
             <wp:positionH relativeFrom="column">
               <wp:posOffset>2867025</wp:posOffset>
@@ -4249,7 +3457,7 @@
                     <pic:cNvPicPr/>
                   </pic:nvPicPr>
                   <pic:blipFill>
-                    <a:blip r:embed="rId32" cstate="print">
+                    <a:blip r:embed="rId24" cstate="print">
                       <a:extLst>
                         <a:ext uri="{28A0092B-C50C-407E-A947-70E740481C1C}">
                           <a14:useLocalDpi xmlns:a14="http://schemas.microsoft.com/office/drawing/2010/main" val="0"/>
@@ -4355,6 +3563,9 @@
     </w:p>
     <w:p>
       <w:r>
+        <w:rPr>
+          <w:noProof/>
+        </w:rPr>
         <w:drawing>
           <wp:anchor distT="0" distB="0" distL="114300" distR="114300" simplePos="0" relativeHeight="251683840" behindDoc="0" locked="0" layoutInCell="1" allowOverlap="1" wp14:anchorId="006230F7" wp14:editId="4253812E">
             <wp:simplePos x="0" y="0"/>
@@ -4379,7 +3590,7 @@
                     <pic:cNvPicPr/>
                   </pic:nvPicPr>
                   <pic:blipFill>
-                    <a:blip r:embed="rId33">
+                    <a:blip r:embed="rId25">
                       <a:extLst>
                         <a:ext uri="{28A0092B-C50C-407E-A947-70E740481C1C}">
                           <a14:useLocalDpi xmlns:a14="http://schemas.microsoft.com/office/drawing/2010/main" val="0"/>
@@ -4461,6 +3672,9 @@
     </w:p>
     <w:p>
       <w:r>
+        <w:rPr>
+          <w:noProof/>
+        </w:rPr>
         <w:drawing>
           <wp:anchor distT="0" distB="0" distL="114300" distR="114300" simplePos="0" relativeHeight="251684864" behindDoc="0" locked="0" layoutInCell="1" allowOverlap="1" wp14:anchorId="09CC6B6D" wp14:editId="74F378C2">
             <wp:simplePos x="0" y="0"/>
@@ -4485,7 +3699,7 @@
                     <pic:cNvPicPr/>
                   </pic:nvPicPr>
                   <pic:blipFill>
-                    <a:blip r:embed="rId34">
+                    <a:blip r:embed="rId26">
                       <a:extLst>
                         <a:ext uri="{28A0092B-C50C-407E-A947-70E740481C1C}">
                           <a14:useLocalDpi xmlns:a14="http://schemas.microsoft.com/office/drawing/2010/main" val="0"/>
@@ -4646,6 +3860,9 @@
     </w:p>
     <w:p>
       <w:r>
+        <w:rPr>
+          <w:noProof/>
+        </w:rPr>
         <w:drawing>
           <wp:inline distT="0" distB="0" distL="0" distR="0" wp14:anchorId="580367B8" wp14:editId="08403A86">
             <wp:extent cx="5612130" cy="1283970"/>
@@ -4662,7 +3879,7 @@
                     <pic:cNvPicPr/>
                   </pic:nvPicPr>
                   <pic:blipFill>
-                    <a:blip r:embed="rId35"/>
+                    <a:blip r:embed="rId27"/>
                     <a:stretch>
                       <a:fillRect/>
                     </a:stretch>
@@ -4703,6 +3920,9 @@
     </w:p>
     <w:p>
       <w:r>
+        <w:rPr>
+          <w:noProof/>
+        </w:rPr>
         <w:drawing>
           <wp:anchor distT="0" distB="0" distL="114300" distR="114300" simplePos="0" relativeHeight="251685888" behindDoc="0" locked="0" layoutInCell="1" allowOverlap="1" wp14:anchorId="6AA3974E" wp14:editId="4EED4806">
             <wp:simplePos x="0" y="0"/>
@@ -4727,7 +3947,7 @@
                     <pic:cNvPicPr/>
                   </pic:nvPicPr>
                   <pic:blipFill>
-                    <a:blip r:embed="rId36">
+                    <a:blip r:embed="rId28">
                       <a:extLst>
                         <a:ext uri="{28A0092B-C50C-407E-A947-70E740481C1C}">
                           <a14:useLocalDpi xmlns:a14="http://schemas.microsoft.com/office/drawing/2010/main" val="0"/>
@@ -10637,6 +9857,7 @@
   <w:style w:type="character" w:default="1" w:styleId="DefaultParagraphFont">
     <w:name w:val="Default Paragraph Font"/>
     <w:uiPriority w:val="1"/>
+    <w:semiHidden/>
     <w:unhideWhenUsed/>
   </w:style>
   <w:style w:type="table" w:default="1" w:styleId="TableNormal">

</xml_diff>